<commit_message>
Add narrative big band form module to Big Band Engine with tests and documentation
Made-with: Cursor
</commit_message>
<xml_diff>
--- a/engines/big-band-engine/docs/User_Guide.docx
+++ b/engines/big-band-engine/docs/User_Guide.docx
@@ -138,6 +138,34 @@
         <w:pStyle w:val="Heading1"/>
       </w:pPr>
       <w:r>
+        <w:t>Narrative Big Band Form</w:t>
+      </w:r>
+    </w:p>
+    <w:p>
+      <w:r>
+        <w:t>The `narrative_big_band_form` module adds a form profile for lyrical, atmospheric, evolving jazz-orchestra writing.</w:t>
+      </w:r>
+    </w:p>
+    <w:p>
+      <w:r>
+        <w:t>**Archetypes:** luminous_arc_form, transformed_return_form</w:t>
+      </w:r>
+    </w:p>
+    <w:p>
+      <w:r>
+        <w:t>**Sections:** IntroAtmosphere → Exposition → TransitionalBuild → SoloEnvironment → Recomposition → Coda</w:t>
+      </w:r>
+    </w:p>
+    <w:p>
+      <w:r>
+        <w:t>**Use with bridge:** `run_big_band_form_texture_bridge(..., big_band_form_profile="narrative_big_band_form")` to combine Shorter form + Ligeti texture + narrative big band host.</w:t>
+      </w:r>
+    </w:p>
+    <w:p>
+      <w:pPr>
+        <w:pStyle w:val="Heading1"/>
+      </w:pPr>
+      <w:r>
         <w:t>Appendix: 20 Ways to Start a Big Band Composition</w:t>
       </w:r>
     </w:p>
@@ -239,6 +267,114 @@
     <w:p>
       <w:r>
         <w:t>20. Layered ensemble motion, evolving density</w:t>
+      </w:r>
+    </w:p>
+    <w:p>
+      <w:pPr>
+        <w:pStyle w:val="Heading1"/>
+      </w:pPr>
+      <w:r>
+        <w:t>Appendix: 20 Ways to Start a Narrative Big Band Composition</w:t>
+      </w:r>
+    </w:p>
+    <w:p>
+      <w:r>
+        <w:t>1. Atmosphere intro: suspended pads, 4–8 bars</w:t>
+      </w:r>
+    </w:p>
+    <w:p>
+      <w:r>
+        <w:t>2. Lyrical exposition: motivic statement, 8–14 bars</w:t>
+      </w:r>
+    </w:p>
+    <w:p>
+      <w:r>
+        <w:t>3. Transitional build: density increase, motive saturation</w:t>
+      </w:r>
+    </w:p>
+    <w:p>
+      <w:r>
+        <w:t>4. Solo environment: floating harmonic center, 12–24 bars</w:t>
+      </w:r>
+    </w:p>
+    <w:p>
+      <w:r>
+        <w:t>5. Recomposition: luminous homecoming or transformed echo</w:t>
+      </w:r>
+    </w:p>
+    <w:p>
+      <w:r>
+        <w:t>6. Coda: dissolve, final broad sonority, or ostinato fade</w:t>
+      </w:r>
+    </w:p>
+    <w:p>
+      <w:r>
+        <w:t>7. Structural phrase: 4–8 bars, mixed rhythm</w:t>
+      </w:r>
+    </w:p>
+    <w:p>
+      <w:r>
+        <w:t>8. Hovering texture phrase: 5–9 bars, sustained</w:t>
+      </w:r>
+    </w:p>
+    <w:p>
+      <w:r>
+        <w:t>9. Sequential build phrase: 4–7 bars, ascending</w:t>
+      </w:r>
+    </w:p>
+    <w:p>
+      <w:r>
+        <w:t>10. Release phrase: 3–6 bars, decaying</w:t>
+      </w:r>
+    </w:p>
+    <w:p>
+      <w:r>
+        <w:t>11. Motive introduction in exposition</w:t>
+      </w:r>
+    </w:p>
+    <w:p>
+      <w:r>
+        <w:t>12. Motive variation: interval expansion, fragmentation</w:t>
+      </w:r>
+    </w:p>
+    <w:p>
+      <w:r>
+        <w:t>13. Transition: density increase, pedal + harmonic brightening</w:t>
+      </w:r>
+    </w:p>
+    <w:p>
+      <w:r>
+        <w:t>14. Transition: register climb, texture thickening</w:t>
+      </w:r>
+    </w:p>
+    <w:p>
+      <w:r>
+        <w:t>15. Solo: static mode, slow harmonic sequence</w:t>
+      </w:r>
+    </w:p>
+    <w:p>
+      <w:r>
+        <w:t>16. Solo: expanding-center option</w:t>
+      </w:r>
+    </w:p>
+    <w:p>
+      <w:r>
+        <w:t>17. Recap: luminous_homecoming</w:t>
+      </w:r>
+    </w:p>
+    <w:p>
+      <w:r>
+        <w:t>18. Recap: transformed_echo</w:t>
+      </w:r>
+    </w:p>
+    <w:p>
+      <w:r>
+        <w:t>19. Coda: dissolve (4–10 bars)</w:t>
+      </w:r>
+    </w:p>
+    <w:p>
+      <w:r>
+        <w:t>20. Coda: ostinato_fade (8–16 bars)</w:t>
       </w:r>
     </w:p>
     <w:sectPr>

</xml_diff>